<commit_message>
Clarify submit + attachment, remove photo request
- Prominent "Submit application to email" button with email icon + helper note
- Attachment field with paper-clip icon and print/fill/scan/upload guidance
  for phone users who can't edit on device
- Remove all photo requests from form, document (PDF/DOCX) and preview

Co-Authored-By: Claude Opus 4.8 <noreply@anthropic.com>
</commit_message>
<xml_diff>
--- a/documents/Business-Hub-Application-Form.docx
+++ b/documents/Business-Hub-Application-Form.docx
@@ -491,111 +491,6 @@
           <w:szCs w:val="22"/>
         </w:rPr>
         <w:t xml:space="preserve">12. Where did you learn computer skills? __________________</w:t>
-      </w:r>
-    </w:p>
-    <w:p>
-      <w:pPr>
-        <w:spacing w:after="120"/>
-        <w:rPr>
-          <w:sz w:val="22"/>
-          <w:szCs w:val="22"/>
-        </w:rPr>
-      </w:pPr>
-    </w:p>
-    <w:p>
-      <w:pPr>
-        <w:spacing w:after="120"/>
-        <w:rPr>
-          <w:sz w:val="22"/>
-          <w:szCs w:val="22"/>
-        </w:rPr>
-      </w:pPr>
-      <w:r>
-        <w:rPr>
-          <w:sz w:val="22"/>
-          <w:szCs w:val="22"/>
-        </w:rPr>
-        <w:t xml:space="preserve">13. PHOTO — attach or paste a recent photo in the box below:</w:t>
-      </w:r>
-    </w:p>
-    <w:p>
-      <w:pPr>
-        <w:spacing w:after="120"/>
-        <w:rPr>
-          <w:sz w:val="22"/>
-          <w:szCs w:val="22"/>
-        </w:rPr>
-      </w:pPr>
-      <w:r>
-        <w:rPr>
-          <w:sz w:val="22"/>
-          <w:szCs w:val="22"/>
-        </w:rPr>
-        <w:t xml:space="preserve">     +--------------------------+</w:t>
-      </w:r>
-    </w:p>
-    <w:p>
-      <w:pPr>
-        <w:spacing w:after="120"/>
-        <w:rPr>
-          <w:sz w:val="22"/>
-          <w:szCs w:val="22"/>
-        </w:rPr>
-      </w:pPr>
-      <w:r>
-        <w:rPr>
-          <w:sz w:val="22"/>
-          <w:szCs w:val="22"/>
-        </w:rPr>
-        <w:t xml:space="preserve">     |                          |</w:t>
-      </w:r>
-    </w:p>
-    <w:p>
-      <w:pPr>
-        <w:spacing w:after="120"/>
-        <w:rPr>
-          <w:sz w:val="22"/>
-          <w:szCs w:val="22"/>
-        </w:rPr>
-      </w:pPr>
-      <w:r>
-        <w:rPr>
-          <w:sz w:val="22"/>
-          <w:szCs w:val="22"/>
-        </w:rPr>
-        <w:t xml:space="preserve">     |        ADD PHOTO         |</w:t>
-      </w:r>
-    </w:p>
-    <w:p>
-      <w:pPr>
-        <w:spacing w:after="120"/>
-        <w:rPr>
-          <w:sz w:val="22"/>
-          <w:szCs w:val="22"/>
-        </w:rPr>
-      </w:pPr>
-      <w:r>
-        <w:rPr>
-          <w:sz w:val="22"/>
-          <w:szCs w:val="22"/>
-        </w:rPr>
-        <w:t xml:space="preserve">     |                          |</w:t>
-      </w:r>
-    </w:p>
-    <w:p>
-      <w:pPr>
-        <w:spacing w:after="120"/>
-        <w:rPr>
-          <w:sz w:val="22"/>
-          <w:szCs w:val="22"/>
-        </w:rPr>
-      </w:pPr>
-      <w:r>
-        <w:rPr>
-          <w:sz w:val="22"/>
-          <w:szCs w:val="22"/>
-        </w:rPr>
-        <w:t xml:space="preserve">     +--------------------------+</w:t>
       </w:r>
     </w:p>
     <w:p>

</xml_diff>